<commit_message>
feat: starting of the project2,
</commit_message>
<xml_diff>
--- a/CustomerBChart/customerBchartRequirements.docx
+++ b/CustomerBChart/customerBchartRequirements.docx
@@ -9,12 +9,17 @@
         <w:ind w:left="0"/>
         <w:rPr>
           <w:rFonts w:ascii="Grandview" w:hAnsi="Grandview" w:cs="Arial"/>
-          <w:lang w:val="en-NZ"/>
-        </w:rPr>
-      </w:pPr>
-      <w:r>
-        <w:rPr>
-          <w:rFonts w:ascii="Grandview" w:hAnsi="Grandview" w:cs="Arial"/>
+          <w:sz w:val="28"/>
+          <w:szCs w:val="28"/>
+          <w:lang w:val="en-NZ"/>
+        </w:rPr>
+      </w:pPr>
+      <w:r>
+        <w:rPr>
+          <w:rFonts w:ascii="Grandview" w:hAnsi="Grandview" w:cs="Arial"/>
+          <w:sz w:val="28"/>
+          <w:szCs w:val="28"/>
+          <w:highlight w:val="yellow"/>
           <w:lang w:val="en-NZ"/>
         </w:rPr>
         <w:t xml:space="preserve">- </w:t>
@@ -24,6 +29,9 @@
           <w:rFonts w:ascii="Grandview" w:hAnsi="Grandview" w:cs="Arial"/>
           <w:b/>
           <w:bCs/>
+          <w:sz w:val="28"/>
+          <w:szCs w:val="28"/>
+          <w:highlight w:val="yellow"/>
           <w:lang w:val="en-NZ"/>
         </w:rPr>
         <w:t xml:space="preserve">Chart1: </w:t>
@@ -33,6 +41,9 @@
           <w:rFonts w:ascii="Grandview" w:hAnsi="Grandview"/>
           <w:b/>
           <w:bCs/>
+          <w:sz w:val="28"/>
+          <w:szCs w:val="28"/>
+          <w:highlight w:val="yellow"/>
         </w:rPr>
         <w:t xml:space="preserve">The proportion of the top 100 YouTube channels in each </w:t>
       </w:r>
@@ -41,14 +52,76 @@
           <w:rFonts w:ascii="Grandview" w:hAnsi="Grandview"/>
           <w:b/>
           <w:bCs/>
+          <w:sz w:val="28"/>
+          <w:szCs w:val="28"/>
+          <w:highlight w:val="yellow"/>
         </w:rPr>
         <w:t>country</w:t>
       </w:r>
       <w:r>
         <w:rPr>
           <w:rFonts w:ascii="Grandview" w:hAnsi="Grandview"/>
-        </w:rPr>
-        <w:t>. </w:t>
+          <w:sz w:val="28"/>
+          <w:szCs w:val="28"/>
+          <w:highlight w:val="yellow"/>
+        </w:rPr>
+        <w:t>.</w:t>
+      </w:r>
+      <w:r>
+        <w:rPr>
+          <w:rFonts w:ascii="Grandview" w:hAnsi="Grandview"/>
+          <w:sz w:val="28"/>
+          <w:szCs w:val="28"/>
+        </w:rPr>
+        <w:t> </w:t>
+      </w:r>
+      <w:r>
+        <w:rPr>
+          <w:rFonts w:ascii="Grandview" w:hAnsi="Grandview"/>
+          <w:sz w:val="28"/>
+          <w:szCs w:val="28"/>
+        </w:rPr>
+        <w:t xml:space="preserve"> (</w:t>
+      </w:r>
+      <w:r>
+        <w:rPr>
+          <w:rFonts w:ascii="Grandview" w:hAnsi="Grandview"/>
+          <w:b/>
+          <w:bCs/>
+          <w:sz w:val="28"/>
+          <w:szCs w:val="28"/>
+        </w:rPr>
+        <w:t>options</w:t>
+      </w:r>
+      <w:r>
+        <w:rPr>
+          <w:rFonts w:ascii="Grandview" w:hAnsi="Grandview"/>
+          <w:b/>
+          <w:bCs/>
+          <w:sz w:val="28"/>
+          <w:szCs w:val="28"/>
+        </w:rPr>
+        <w:t xml:space="preserve"> </w:t>
+      </w:r>
+      <w:proofErr w:type="spellStart"/>
+      <w:r>
+        <w:rPr>
+          <w:rFonts w:ascii="Grandview" w:hAnsi="Grandview"/>
+          <w:b/>
+          <w:bCs/>
+          <w:sz w:val="28"/>
+          <w:szCs w:val="28"/>
+        </w:rPr>
+        <w:t>ui</w:t>
+      </w:r>
+      <w:proofErr w:type="spellEnd"/>
+      <w:r>
+        <w:rPr>
+          <w:rFonts w:ascii="Grandview" w:hAnsi="Grandview"/>
+          <w:sz w:val="28"/>
+          <w:szCs w:val="28"/>
+        </w:rPr>
+        <w:t>)</w:t>
       </w:r>
     </w:p>
     <w:p>
@@ -58,6 +131,8 @@
         <w:ind w:left="0"/>
         <w:rPr>
           <w:rFonts w:ascii="Grandview" w:hAnsi="Grandview" w:cs="Arial"/>
+          <w:sz w:val="28"/>
+          <w:szCs w:val="28"/>
           <w:lang w:val="en-NZ"/>
         </w:rPr>
       </w:pPr>
@@ -71,23 +146,52 @@
           <w:rFonts w:ascii="Grandview" w:hAnsi="Grandview" w:cs="Arial"/>
           <w:b/>
           <w:bCs/>
-          <w:lang w:val="en-NZ"/>
-        </w:rPr>
-      </w:pPr>
-      <w:r>
-        <w:rPr>
-          <w:rFonts w:ascii="Grandview" w:hAnsi="Grandview" w:cs="Arial"/>
-          <w:b/>
-          <w:bCs/>
-          <w:lang w:val="en-NZ"/>
-        </w:rPr>
-        <w:t>- Chart2: Relationship between the ‘</w:t>
-      </w:r>
-      <w:r>
-        <w:rPr>
-          <w:rFonts w:ascii="Grandview" w:hAnsi="Grandview" w:cs="Arial"/>
-          <w:b/>
-          <w:bCs/>
+          <w:sz w:val="28"/>
+          <w:szCs w:val="28"/>
+          <w:lang w:val="en-NZ"/>
+        </w:rPr>
+      </w:pPr>
+      <w:r>
+        <w:rPr>
+          <w:rFonts w:ascii="Grandview" w:hAnsi="Grandview" w:cs="Arial"/>
+          <w:b/>
+          <w:bCs/>
+          <w:sz w:val="28"/>
+          <w:szCs w:val="28"/>
+          <w:lang w:val="en-NZ"/>
+        </w:rPr>
+        <w:t xml:space="preserve">- </w:t>
+      </w:r>
+      <w:r>
+        <w:rPr>
+          <w:rFonts w:ascii="Grandview" w:hAnsi="Grandview" w:cs="Arial"/>
+          <w:b/>
+          <w:bCs/>
+          <w:color w:val="EE0000"/>
+          <w:sz w:val="28"/>
+          <w:szCs w:val="28"/>
+          <w:lang w:val="en-NZ"/>
+        </w:rPr>
+        <w:t>Chart2</w:t>
+      </w:r>
+      <w:r>
+        <w:rPr>
+          <w:rFonts w:ascii="Grandview" w:hAnsi="Grandview" w:cs="Arial"/>
+          <w:b/>
+          <w:bCs/>
+          <w:sz w:val="28"/>
+          <w:szCs w:val="28"/>
+          <w:lang w:val="en-NZ"/>
+        </w:rPr>
+        <w:t>: Relationship between the ‘</w:t>
+      </w:r>
+      <w:r>
+        <w:rPr>
+          <w:rFonts w:ascii="Grandview" w:hAnsi="Grandview" w:cs="Arial"/>
+          <w:b/>
+          <w:bCs/>
+          <w:sz w:val="28"/>
+          <w:szCs w:val="28"/>
           <w:lang w:val="en-NZ"/>
         </w:rPr>
         <w:t>comment</w:t>
@@ -97,6 +201,8 @@
           <w:rFonts w:ascii="Grandview" w:hAnsi="Grandview" w:cs="Arial"/>
           <w:b/>
           <w:bCs/>
+          <w:sz w:val="28"/>
+          <w:szCs w:val="28"/>
           <w:lang w:val="en-NZ"/>
         </w:rPr>
         <w:t>’</w:t>
@@ -106,6 +212,8 @@
           <w:rFonts w:ascii="Grandview" w:hAnsi="Grandview" w:cs="Arial"/>
           <w:b/>
           <w:bCs/>
+          <w:sz w:val="28"/>
+          <w:szCs w:val="28"/>
           <w:lang w:val="en-NZ"/>
         </w:rPr>
         <w:t xml:space="preserve"> and ‘subscribers’</w:t>
@@ -118,6 +226,8 @@
         <w:ind w:left="0"/>
         <w:rPr>
           <w:rFonts w:ascii="Grandview" w:hAnsi="Grandview" w:cs="Arial"/>
+          <w:sz w:val="28"/>
+          <w:szCs w:val="28"/>
           <w:lang w:val="en-NZ"/>
         </w:rPr>
       </w:pPr>
@@ -131,14 +241,18 @@
           <w:rFonts w:ascii="Grandview" w:hAnsi="Grandview" w:cs="Arial"/>
           <w:b/>
           <w:bCs/>
-          <w:lang w:val="en-NZ"/>
-        </w:rPr>
-      </w:pPr>
-      <w:r>
-        <w:rPr>
-          <w:rFonts w:ascii="Grandview" w:hAnsi="Grandview" w:cs="Arial"/>
-          <w:b/>
-          <w:bCs/>
+          <w:sz w:val="28"/>
+          <w:szCs w:val="28"/>
+          <w:lang w:val="en-NZ"/>
+        </w:rPr>
+      </w:pPr>
+      <w:r>
+        <w:rPr>
+          <w:rFonts w:ascii="Grandview" w:hAnsi="Grandview" w:cs="Arial"/>
+          <w:b/>
+          <w:bCs/>
+          <w:sz w:val="28"/>
+          <w:szCs w:val="28"/>
           <w:lang w:val="en-NZ"/>
         </w:rPr>
         <w:t xml:space="preserve">- Chart3: Each </w:t>
@@ -148,6 +262,8 @@
           <w:rFonts w:ascii="Grandview" w:hAnsi="Grandview" w:cs="Arial"/>
           <w:b/>
           <w:bCs/>
+          <w:sz w:val="28"/>
+          <w:szCs w:val="28"/>
           <w:lang w:val="en-NZ"/>
         </w:rPr>
         <w:t>category’s</w:t>
@@ -157,6 +273,8 @@
           <w:rFonts w:ascii="Grandview" w:hAnsi="Grandview" w:cs="Arial"/>
           <w:b/>
           <w:bCs/>
+          <w:sz w:val="28"/>
+          <w:szCs w:val="28"/>
           <w:lang w:val="en-NZ"/>
         </w:rPr>
         <w:t xml:space="preserve"> number of youtubers </w:t>
@@ -169,6 +287,8 @@
         <w:ind w:left="0"/>
         <w:rPr>
           <w:rFonts w:ascii="Grandview" w:hAnsi="Grandview" w:cs="Arial"/>
+          <w:sz w:val="28"/>
+          <w:szCs w:val="28"/>
           <w:lang w:val="en-NZ"/>
         </w:rPr>
       </w:pPr>
@@ -179,14 +299,18 @@
           <w:rFonts w:ascii="Grandview" w:hAnsi="Grandview" w:cs="Arial"/>
           <w:b/>
           <w:bCs/>
-          <w:lang w:val="en-NZ"/>
-        </w:rPr>
-      </w:pPr>
-      <w:r>
-        <w:rPr>
-          <w:rFonts w:ascii="Grandview" w:hAnsi="Grandview" w:cs="Arial"/>
-          <w:b/>
-          <w:bCs/>
+          <w:sz w:val="28"/>
+          <w:szCs w:val="28"/>
+          <w:lang w:val="en-NZ"/>
+        </w:rPr>
+      </w:pPr>
+      <w:r>
+        <w:rPr>
+          <w:rFonts w:ascii="Grandview" w:hAnsi="Grandview" w:cs="Arial"/>
+          <w:b/>
+          <w:bCs/>
+          <w:sz w:val="28"/>
+          <w:szCs w:val="28"/>
           <w:lang w:val="en-NZ"/>
         </w:rPr>
         <w:t xml:space="preserve">- Chart4: The top 5 YouTube channels' average view changes </w:t>
@@ -196,9 +320,58 @@
           <w:rFonts w:ascii="Grandview" w:hAnsi="Grandview" w:cs="Arial"/>
           <w:b/>
           <w:bCs/>
+          <w:sz w:val="28"/>
+          <w:szCs w:val="28"/>
           <w:lang w:val="en-NZ"/>
         </w:rPr>
         <w:t xml:space="preserve">every month </w:t>
+      </w:r>
+    </w:p>
+    <w:p>
+      <w:pPr>
+        <w:rPr>
+          <w:rFonts w:ascii="Grandview" w:hAnsi="Grandview" w:cs="Arial"/>
+          <w:b/>
+          <w:bCs/>
+          <w:sz w:val="28"/>
+          <w:szCs w:val="28"/>
+          <w:lang w:val="en-NZ"/>
+        </w:rPr>
+      </w:pPr>
+      <w:r>
+        <w:rPr>
+          <w:rFonts w:ascii="Grandview" w:hAnsi="Grandview" w:cs="Arial"/>
+          <w:b/>
+          <w:bCs/>
+          <w:sz w:val="28"/>
+          <w:szCs w:val="28"/>
+          <w:lang w:val="en-NZ"/>
+        </w:rPr>
+        <w:t xml:space="preserve">(switch </w:t>
+      </w:r>
+      <w:proofErr w:type="spellStart"/>
+      <w:r>
+        <w:rPr>
+          <w:rFonts w:ascii="Grandview" w:hAnsi="Grandview" w:cs="Arial"/>
+          <w:b/>
+          <w:bCs/>
+          <w:sz w:val="28"/>
+          <w:szCs w:val="28"/>
+          <w:lang w:val="en-NZ"/>
+        </w:rPr>
+        <w:t>btn</w:t>
+      </w:r>
+      <w:proofErr w:type="spellEnd"/>
+      <w:r>
+        <w:rPr>
+          <w:rFonts w:ascii="Grandview" w:hAnsi="Grandview" w:cs="Arial"/>
+          <w:b/>
+          <w:bCs/>
+          <w:sz w:val="28"/>
+          <w:szCs w:val="28"/>
+          <w:lang w:val="en-NZ"/>
+        </w:rPr>
+        <w:t>)</w:t>
       </w:r>
     </w:p>
     <w:p>
@@ -210,11 +383,15 @@
         </w:numPr>
         <w:rPr>
           <w:rFonts w:ascii="Grandview" w:hAnsi="Grandview" w:cs="Arial"/>
-        </w:rPr>
-      </w:pPr>
-      <w:r>
-        <w:rPr>
-          <w:rFonts w:ascii="Grandview" w:hAnsi="Grandview" w:cs="Arial"/>
+          <w:sz w:val="28"/>
+          <w:szCs w:val="28"/>
+        </w:rPr>
+      </w:pPr>
+      <w:r>
+        <w:rPr>
+          <w:rFonts w:ascii="Grandview" w:hAnsi="Grandview" w:cs="Arial"/>
+          <w:sz w:val="28"/>
+          <w:szCs w:val="28"/>
           <w:lang w:val="en-NZ"/>
         </w:rPr>
         <w:t xml:space="preserve">Display </w:t>
@@ -222,6 +399,8 @@
       <w:r>
         <w:rPr>
           <w:rFonts w:ascii="Grandview" w:hAnsi="Grandview" w:cs="Arial"/>
+          <w:sz w:val="28"/>
+          <w:szCs w:val="28"/>
           <w:lang w:val="en-NZ"/>
         </w:rPr>
         <w:t>x-axis</w:t>
@@ -229,6 +408,8 @@
       <w:r>
         <w:rPr>
           <w:rFonts w:ascii="Grandview" w:hAnsi="Grandview" w:cs="Arial"/>
+          <w:sz w:val="28"/>
+          <w:szCs w:val="28"/>
           <w:lang w:val="en-NZ"/>
         </w:rPr>
         <w:t xml:space="preserve"> tick with Month </w:t>
@@ -236,6 +417,8 @@
       <w:r>
         <w:rPr>
           <w:rFonts w:ascii="Grandview" w:hAnsi="Grandview" w:cs="Arial"/>
+          <w:sz w:val="28"/>
+          <w:szCs w:val="28"/>
           <w:lang w:val="en-NZ"/>
         </w:rPr>
         <w:t>Name (</w:t>
@@ -243,6 +426,8 @@
       <w:r>
         <w:rPr>
           <w:rFonts w:ascii="Grandview" w:hAnsi="Grandview" w:cs="Arial"/>
+          <w:sz w:val="28"/>
+          <w:szCs w:val="28"/>
           <w:lang w:val="en-NZ"/>
         </w:rPr>
         <w:t>‘Jan’, ‘Feb’ … or ‘January’, ‘</w:t>
@@ -250,6 +435,8 @@
       <w:r>
         <w:rPr>
           <w:rFonts w:ascii="Grandview" w:hAnsi="Grandview" w:cs="Arial"/>
+          <w:sz w:val="28"/>
+          <w:szCs w:val="28"/>
           <w:lang w:val="en-NZ"/>
         </w:rPr>
         <w:t>February</w:t>
@@ -257,6 +444,8 @@
       <w:r>
         <w:rPr>
           <w:rFonts w:ascii="Grandview" w:hAnsi="Grandview" w:cs="Arial"/>
+          <w:sz w:val="28"/>
+          <w:szCs w:val="28"/>
           <w:lang w:val="en-NZ"/>
         </w:rPr>
         <w:t>’…)</w:t>
@@ -268,26 +457,55 @@
           <w:rFonts w:ascii="Grandview" w:hAnsi="Grandview" w:cs="Arial"/>
           <w:b/>
           <w:bCs/>
-          <w:lang w:val="en-NZ"/>
-        </w:rPr>
-      </w:pPr>
-      <w:r>
-        <w:rPr>
-          <w:rFonts w:ascii="Grandview" w:hAnsi="Grandview" w:cs="Arial"/>
-          <w:b/>
-          <w:bCs/>
-          <w:lang w:val="en-NZ"/>
-        </w:rPr>
-        <w:t xml:space="preserve">- Chart5: </w:t>
-      </w:r>
-      <w:r>
-        <w:rPr>
-          <w:rFonts w:ascii="Grandview" w:hAnsi="Grandview" w:cs="Arial"/>
-          <w:b/>
-          <w:bCs/>
-          <w:lang w:val="en-NZ"/>
-        </w:rPr>
-        <w:t>The top 5 YouTube channels’ Quarterly income.</w:t>
+          <w:sz w:val="28"/>
+          <w:szCs w:val="28"/>
+          <w:lang w:val="en-NZ"/>
+        </w:rPr>
+      </w:pPr>
+      <w:r>
+        <w:rPr>
+          <w:rFonts w:ascii="Grandview" w:hAnsi="Grandview" w:cs="Arial"/>
+          <w:b/>
+          <w:bCs/>
+          <w:sz w:val="28"/>
+          <w:szCs w:val="28"/>
+          <w:lang w:val="en-NZ"/>
+        </w:rPr>
+        <w:t xml:space="preserve">- </w:t>
+      </w:r>
+      <w:r>
+        <w:rPr>
+          <w:rFonts w:ascii="Grandview" w:hAnsi="Grandview" w:cs="Arial"/>
+          <w:b/>
+          <w:bCs/>
+          <w:color w:val="EE0000"/>
+          <w:sz w:val="28"/>
+          <w:szCs w:val="28"/>
+          <w:lang w:val="en-NZ"/>
+        </w:rPr>
+        <w:t>Chart5</w:t>
+      </w:r>
+      <w:r>
+        <w:rPr>
+          <w:rFonts w:ascii="Grandview" w:hAnsi="Grandview" w:cs="Arial"/>
+          <w:b/>
+          <w:bCs/>
+          <w:sz w:val="28"/>
+          <w:szCs w:val="28"/>
+          <w:lang w:val="en-NZ"/>
+        </w:rPr>
+        <w:t>: The top 5 YouTube channels’ Quarterly income.</w:t>
+      </w:r>
+      <w:r>
+        <w:rPr>
+          <w:rFonts w:ascii="Grandview" w:hAnsi="Grandview" w:cs="Arial"/>
+          <w:b/>
+          <w:bCs/>
+          <w:sz w:val="28"/>
+          <w:szCs w:val="28"/>
+          <w:lang w:val="en-NZ"/>
+        </w:rPr>
+        <w:t xml:space="preserve"> (check box)</w:t>
       </w:r>
     </w:p>
     <w:p>
@@ -299,12 +517,16 @@
         </w:numPr>
         <w:rPr>
           <w:rFonts w:ascii="Grandview" w:hAnsi="Grandview" w:cs="Arial"/>
-          <w:lang w:val="en-NZ"/>
-        </w:rPr>
-      </w:pPr>
-      <w:r>
-        <w:rPr>
-          <w:rFonts w:ascii="Grandview" w:hAnsi="Grandview" w:cs="Arial"/>
+          <w:sz w:val="28"/>
+          <w:szCs w:val="28"/>
+          <w:lang w:val="en-NZ"/>
+        </w:rPr>
+      </w:pPr>
+      <w:r>
+        <w:rPr>
+          <w:rFonts w:ascii="Grandview" w:hAnsi="Grandview" w:cs="Arial"/>
+          <w:sz w:val="28"/>
+          <w:szCs w:val="28"/>
           <w:lang w:val="en-NZ"/>
         </w:rPr>
         <w:t>Use stacked bar chart</w:t>
@@ -316,35 +538,185 @@
           <w:rFonts w:ascii="Grandview" w:hAnsi="Grandview" w:cs="Arial"/>
           <w:b/>
           <w:bCs/>
-          <w:lang w:val="en-NZ"/>
-        </w:rPr>
-      </w:pPr>
-      <w:r>
-        <w:rPr>
-          <w:rFonts w:ascii="Grandview" w:hAnsi="Grandview" w:cs="Arial"/>
-          <w:b/>
-          <w:bCs/>
-          <w:lang w:val="en-NZ"/>
-        </w:rPr>
-        <w:t xml:space="preserve">- Chart6: The number of YouTube channels by </w:t>
-      </w:r>
-      <w:r>
-        <w:rPr>
-          <w:rFonts w:ascii="Grandview" w:hAnsi="Grandview" w:cs="Arial"/>
-          <w:b/>
-          <w:bCs/>
-          <w:lang w:val="en-NZ"/>
-        </w:rPr>
-        <w:t>‘MainTopic’</w:t>
-      </w:r>
-      <w:r>
-        <w:rPr>
-          <w:rFonts w:ascii="Grandview" w:hAnsi="Grandview" w:cs="Arial"/>
-          <w:b/>
-          <w:bCs/>
+          <w:sz w:val="28"/>
+          <w:szCs w:val="28"/>
+          <w:lang w:val="en-NZ"/>
+        </w:rPr>
+      </w:pPr>
+      <w:r>
+        <w:rPr>
+          <w:rFonts w:ascii="Grandview" w:hAnsi="Grandview" w:cs="Arial"/>
+          <w:b/>
+          <w:bCs/>
+          <w:sz w:val="28"/>
+          <w:szCs w:val="28"/>
+          <w:lang w:val="en-NZ"/>
+        </w:rPr>
+        <w:t xml:space="preserve">- </w:t>
+      </w:r>
+      <w:r>
+        <w:rPr>
+          <w:rFonts w:ascii="Grandview" w:hAnsi="Grandview" w:cs="Arial"/>
+          <w:b/>
+          <w:bCs/>
+          <w:color w:val="EE0000"/>
+          <w:sz w:val="28"/>
+          <w:szCs w:val="28"/>
+          <w:lang w:val="en-NZ"/>
+        </w:rPr>
+        <w:t>Chart6</w:t>
+      </w:r>
+      <w:r>
+        <w:rPr>
+          <w:rFonts w:ascii="Grandview" w:hAnsi="Grandview" w:cs="Arial"/>
+          <w:b/>
+          <w:bCs/>
+          <w:sz w:val="28"/>
+          <w:szCs w:val="28"/>
+          <w:lang w:val="en-NZ"/>
+        </w:rPr>
+        <w:t xml:space="preserve">: The number of YouTube channels by </w:t>
+      </w:r>
+      <w:r>
+        <w:rPr>
+          <w:rFonts w:ascii="Grandview" w:hAnsi="Grandview" w:cs="Arial"/>
+          <w:b/>
+          <w:bCs/>
+          <w:sz w:val="28"/>
+          <w:szCs w:val="28"/>
+          <w:lang w:val="en-NZ"/>
+        </w:rPr>
+        <w:t>‘</w:t>
+      </w:r>
+      <w:proofErr w:type="spellStart"/>
+      <w:r>
+        <w:rPr>
+          <w:rFonts w:ascii="Grandview" w:hAnsi="Grandview" w:cs="Arial"/>
+          <w:b/>
+          <w:bCs/>
+          <w:sz w:val="28"/>
+          <w:szCs w:val="28"/>
+          <w:lang w:val="en-NZ"/>
+        </w:rPr>
+        <w:t>MainTopic</w:t>
+      </w:r>
+      <w:proofErr w:type="spellEnd"/>
+      <w:r>
+        <w:rPr>
+          <w:rFonts w:ascii="Grandview" w:hAnsi="Grandview" w:cs="Arial"/>
+          <w:b/>
+          <w:bCs/>
+          <w:sz w:val="28"/>
+          <w:szCs w:val="28"/>
+          <w:lang w:val="en-NZ"/>
+        </w:rPr>
+        <w:t>’</w:t>
+      </w:r>
+      <w:r>
+        <w:rPr>
+          <w:rFonts w:ascii="Grandview" w:hAnsi="Grandview" w:cs="Arial"/>
+          <w:b/>
+          <w:bCs/>
+          <w:sz w:val="28"/>
+          <w:szCs w:val="28"/>
           <w:lang w:val="en-NZ"/>
         </w:rPr>
         <w:t xml:space="preserve"> </w:t>
+      </w:r>
+      <w:r>
+        <w:rPr>
+          <w:rFonts w:ascii="Grandview" w:hAnsi="Grandview" w:cs="Arial"/>
+          <w:b/>
+          <w:bCs/>
+          <w:sz w:val="28"/>
+          <w:szCs w:val="28"/>
+          <w:lang w:val="en-NZ"/>
+        </w:rPr>
+        <w:t xml:space="preserve"> </w:t>
+      </w:r>
+    </w:p>
+    <w:p>
+      <w:pPr>
+        <w:rPr>
+          <w:rFonts w:ascii="Grandview" w:hAnsi="Grandview" w:cs="Arial"/>
+          <w:b/>
+          <w:bCs/>
+          <w:sz w:val="28"/>
+          <w:szCs w:val="28"/>
+          <w:lang w:val="en-NZ"/>
+        </w:rPr>
+      </w:pPr>
+      <w:proofErr w:type="gramStart"/>
+      <w:r>
+        <w:rPr>
+          <w:rFonts w:ascii="Grandview" w:hAnsi="Grandview" w:cs="Arial"/>
+          <w:b/>
+          <w:bCs/>
+          <w:sz w:val="28"/>
+          <w:szCs w:val="28"/>
+          <w:lang w:val="en-NZ"/>
+        </w:rPr>
+        <w:t>( input</w:t>
+      </w:r>
+      <w:proofErr w:type="gramEnd"/>
+      <w:r>
+        <w:rPr>
+          <w:rFonts w:ascii="Grandview" w:hAnsi="Grandview" w:cs="Arial"/>
+          <w:b/>
+          <w:bCs/>
+          <w:sz w:val="28"/>
+          <w:szCs w:val="28"/>
+          <w:lang w:val="en-NZ"/>
+        </w:rPr>
+        <w:t xml:space="preserve">, </w:t>
+      </w:r>
+      <w:proofErr w:type="spellStart"/>
+      <w:proofErr w:type="gramStart"/>
+      <w:r>
+        <w:rPr>
+          <w:rFonts w:ascii="Grandview" w:hAnsi="Grandview" w:cs="Arial"/>
+          <w:b/>
+          <w:bCs/>
+          <w:sz w:val="28"/>
+          <w:szCs w:val="28"/>
+          <w:lang w:val="en-NZ"/>
+        </w:rPr>
+        <w:t>button,form</w:t>
+      </w:r>
+      <w:proofErr w:type="spellEnd"/>
+      <w:proofErr w:type="gramEnd"/>
+      <w:r>
+        <w:rPr>
+          <w:rFonts w:ascii="Grandview" w:hAnsi="Grandview" w:cs="Arial"/>
+          <w:b/>
+          <w:bCs/>
+          <w:sz w:val="28"/>
+          <w:szCs w:val="28"/>
+          <w:lang w:val="en-NZ"/>
+        </w:rPr>
+        <w:t>,</w:t>
+      </w:r>
+      <w:r>
+        <w:rPr>
+          <w:rFonts w:ascii="Grandview" w:hAnsi="Grandview" w:cs="Arial"/>
+          <w:b/>
+          <w:bCs/>
+          <w:sz w:val="28"/>
+          <w:szCs w:val="28"/>
+          <w:lang w:val="en-NZ"/>
+        </w:rPr>
+        <w:t xml:space="preserve"> badges to show the user input state, like error or success, or pending</w:t>
+      </w:r>
+      <w:r>
+        <w:rPr>
+          <w:rFonts w:ascii="Grandview" w:hAnsi="Grandview" w:cs="Arial"/>
+          <w:b/>
+          <w:bCs/>
+          <w:sz w:val="28"/>
+          <w:szCs w:val="28"/>
+          <w:lang w:val="en-NZ"/>
+        </w:rPr>
+        <w:t>)</w:t>
       </w:r>
     </w:p>
     <w:p>
@@ -356,18 +728,30 @@
         </w:numPr>
         <w:rPr>
           <w:rFonts w:ascii="Grandview" w:hAnsi="Grandview" w:cs="Arial"/>
-          <w:lang w:val="en-NZ"/>
-        </w:rPr>
-      </w:pPr>
-      <w:r>
+          <w:sz w:val="28"/>
+          <w:szCs w:val="28"/>
+          <w:lang w:val="en-NZ"/>
+        </w:rPr>
+      </w:pPr>
+      <w:r>
+        <w:rPr>
+          <w:sz w:val="28"/>
+          <w:szCs w:val="28"/>
+        </w:rPr>
         <w:t>Chart s</w:t>
       </w:r>
       <w:r>
+        <w:rPr>
+          <w:sz w:val="28"/>
+          <w:szCs w:val="28"/>
+        </w:rPr>
         <w:t>hould be displayed interactively by selected year.</w:t>
       </w:r>
       <w:r>
         <w:rPr>
           <w:rFonts w:ascii="Grandview" w:hAnsi="Grandview" w:cs="Arial"/>
+          <w:sz w:val="28"/>
+          <w:szCs w:val="28"/>
           <w:lang w:val="en-NZ"/>
         </w:rPr>
         <w:t xml:space="preserve"> </w:t>
@@ -382,22 +766,19 @@
         </w:numPr>
         <w:rPr>
           <w:rFonts w:ascii="Grandview" w:hAnsi="Grandview" w:cs="Arial"/>
-          <w:lang w:val="en-NZ"/>
-        </w:rPr>
-      </w:pPr>
-      <w:r>
-        <w:rPr>
-          <w:rFonts w:ascii="Grandview" w:hAnsi="Grandview" w:cs="Arial"/>
-          <w:lang w:val="en-NZ"/>
-        </w:rPr>
-        <w:t xml:space="preserve">Get </w:t>
-      </w:r>
-      <w:r>
-        <w:rPr>
-          <w:rFonts w:ascii="Grandview" w:hAnsi="Grandview" w:cs="Arial"/>
-          <w:lang w:val="en-NZ"/>
-        </w:rPr>
-        <w:t>Input from the user is required to accept the year.</w:t>
+          <w:sz w:val="28"/>
+          <w:szCs w:val="28"/>
+          <w:lang w:val="en-NZ"/>
+        </w:rPr>
+      </w:pPr>
+      <w:r>
+        <w:rPr>
+          <w:rFonts w:ascii="Grandview" w:hAnsi="Grandview" w:cs="Arial"/>
+          <w:sz w:val="28"/>
+          <w:szCs w:val="28"/>
+          <w:lang w:val="en-NZ"/>
+        </w:rPr>
+        <w:t>Get Input from the user is required to accept the year.</w:t>
       </w:r>
     </w:p>
     <w:p>
@@ -409,12 +790,16 @@
         </w:numPr>
         <w:rPr>
           <w:rFonts w:ascii="Grandview" w:hAnsi="Grandview" w:cs="Arial"/>
-          <w:lang w:val="en-NZ"/>
-        </w:rPr>
-      </w:pPr>
-      <w:r>
-        <w:rPr>
-          <w:rFonts w:ascii="Grandview" w:hAnsi="Grandview" w:cs="Arial"/>
+          <w:sz w:val="28"/>
+          <w:szCs w:val="28"/>
+          <w:lang w:val="en-NZ"/>
+        </w:rPr>
+      </w:pPr>
+      <w:r>
+        <w:rPr>
+          <w:rFonts w:ascii="Grandview" w:hAnsi="Grandview" w:cs="Arial"/>
+          <w:sz w:val="28"/>
+          <w:szCs w:val="28"/>
           <w:lang w:val="en-NZ"/>
         </w:rPr>
         <w:t xml:space="preserve">Display </w:t>
@@ -422,6 +807,8 @@
       <w:r>
         <w:rPr>
           <w:rFonts w:ascii="Grandview" w:hAnsi="Grandview" w:cs="Arial"/>
+          <w:sz w:val="28"/>
+          <w:szCs w:val="28"/>
           <w:lang w:val="en-NZ"/>
         </w:rPr>
         <w:t>2006</w:t>
@@ -429,6 +816,8 @@
       <w:r>
         <w:rPr>
           <w:rFonts w:ascii="Grandview" w:hAnsi="Grandview" w:cs="Arial"/>
+          <w:sz w:val="28"/>
+          <w:szCs w:val="28"/>
           <w:lang w:val="en-NZ"/>
         </w:rPr>
         <w:t xml:space="preserve"> as default </w:t>
@@ -436,6 +825,8 @@
       <w:r>
         <w:rPr>
           <w:rFonts w:ascii="Grandview" w:hAnsi="Grandview" w:cs="Arial"/>
+          <w:sz w:val="28"/>
+          <w:szCs w:val="28"/>
           <w:lang w:val="en-NZ"/>
         </w:rPr>
         <w:t>year</w:t>
@@ -443,6 +834,8 @@
       <w:r>
         <w:rPr>
           <w:rFonts w:ascii="Grandview" w:hAnsi="Grandview" w:cs="Arial"/>
+          <w:sz w:val="28"/>
+          <w:szCs w:val="28"/>
           <w:lang w:val="en-NZ"/>
         </w:rPr>
         <w:t xml:space="preserve"> </w:t>
@@ -459,11 +852,15 @@
           <w:i/>
           <w:iCs/>
           <w:color w:val="404040" w:themeColor="text1" w:themeTint="BF"/>
-        </w:rPr>
-      </w:pPr>
-      <w:r>
-        <w:rPr>
-          <w:rFonts w:ascii="Grandview" w:hAnsi="Grandview" w:cs="Arial"/>
+          <w:sz w:val="28"/>
+          <w:szCs w:val="28"/>
+        </w:rPr>
+      </w:pPr>
+      <w:r>
+        <w:rPr>
+          <w:rFonts w:ascii="Grandview" w:hAnsi="Grandview" w:cs="Arial"/>
+          <w:sz w:val="28"/>
+          <w:szCs w:val="28"/>
           <w:lang w:val="en-NZ"/>
         </w:rPr>
         <w:t xml:space="preserve">Change the title of the chart according to the </w:t>
@@ -471,6 +868,8 @@
       <w:r>
         <w:rPr>
           <w:rFonts w:ascii="Grandview" w:hAnsi="Grandview" w:cs="Arial"/>
+          <w:sz w:val="28"/>
+          <w:szCs w:val="28"/>
           <w:lang w:val="en-NZ"/>
         </w:rPr>
         <w:t>year</w:t>
@@ -478,6 +877,8 @@
       <w:r>
         <w:rPr>
           <w:rFonts w:ascii="Grandview" w:hAnsi="Grandview" w:cs="Arial"/>
+          <w:sz w:val="28"/>
+          <w:szCs w:val="28"/>
           <w:lang w:val="en-NZ"/>
         </w:rPr>
         <w:t xml:space="preserve"> changes.</w:t>
@@ -492,12 +893,16 @@
         </w:numPr>
         <w:rPr>
           <w:rStyle w:val="SubtleEmphasis"/>
+          <w:sz w:val="28"/>
+          <w:szCs w:val="28"/>
         </w:rPr>
       </w:pPr>
       <w:bookmarkStart w:id="0" w:name="_Hlk115462694"/>
       <w:r>
         <w:rPr>
           <w:rFonts w:ascii="Grandview" w:hAnsi="Grandview" w:cs="Arial"/>
+          <w:sz w:val="28"/>
+          <w:szCs w:val="28"/>
           <w:lang w:val="en-NZ"/>
         </w:rPr>
         <w:t>In mobile ver</w:t>
@@ -505,6 +910,8 @@
       <w:r>
         <w:rPr>
           <w:rFonts w:ascii="Grandview" w:hAnsi="Grandview" w:cs="Arial"/>
+          <w:sz w:val="28"/>
+          <w:szCs w:val="28"/>
           <w:lang w:val="en-NZ"/>
         </w:rPr>
         <w:t>s</w:t>
@@ -512,6 +919,8 @@
       <w:r>
         <w:rPr>
           <w:rFonts w:ascii="Grandview" w:hAnsi="Grandview" w:cs="Arial"/>
+          <w:sz w:val="28"/>
+          <w:szCs w:val="28"/>
           <w:lang w:val="en-NZ"/>
         </w:rPr>
         <w:t>ion, find the best way to accept the user’s input</w:t>
@@ -522,14 +931,18 @@
       <w:pPr>
         <w:rPr>
           <w:rFonts w:ascii="Grandview" w:hAnsi="Grandview" w:cs="Arial"/>
-          <w:lang w:val="en-NZ"/>
-        </w:rPr>
-      </w:pPr>
-      <w:r>
-        <w:rPr>
-          <w:rFonts w:ascii="Grandview" w:hAnsi="Grandview" w:cs="Arial"/>
-          <w:b/>
-          <w:bCs/>
+          <w:sz w:val="28"/>
+          <w:szCs w:val="28"/>
+          <w:lang w:val="en-NZ"/>
+        </w:rPr>
+      </w:pPr>
+      <w:r>
+        <w:rPr>
+          <w:rFonts w:ascii="Grandview" w:hAnsi="Grandview" w:cs="Arial"/>
+          <w:b/>
+          <w:bCs/>
+          <w:sz w:val="28"/>
+          <w:szCs w:val="28"/>
           <w:lang w:val="en-NZ"/>
         </w:rPr>
         <w:t xml:space="preserve">- Chart7: The category that has most </w:t>
@@ -539,6 +952,8 @@
           <w:rFonts w:ascii="Grandview" w:hAnsi="Grandview" w:cs="Arial"/>
           <w:b/>
           <w:bCs/>
+          <w:sz w:val="28"/>
+          <w:szCs w:val="28"/>
           <w:lang w:val="en-NZ"/>
         </w:rPr>
         <w:t>Views</w:t>
@@ -546,6 +961,8 @@
       <w:r>
         <w:rPr>
           <w:rFonts w:ascii="Grandview" w:hAnsi="Grandview" w:cs="Arial"/>
+          <w:sz w:val="28"/>
+          <w:szCs w:val="28"/>
           <w:lang w:val="en-NZ"/>
         </w:rPr>
         <w:t xml:space="preserve"> </w:t>
@@ -560,12 +977,16 @@
         </w:numPr>
         <w:rPr>
           <w:rFonts w:ascii="Grandview" w:hAnsi="Grandview" w:cs="Arial"/>
-          <w:lang w:val="en-NZ"/>
-        </w:rPr>
-      </w:pPr>
-      <w:r>
-        <w:rPr>
-          <w:rFonts w:ascii="Grandview" w:hAnsi="Grandview" w:cs="Arial"/>
+          <w:sz w:val="28"/>
+          <w:szCs w:val="28"/>
+          <w:lang w:val="en-NZ"/>
+        </w:rPr>
+      </w:pPr>
+      <w:r>
+        <w:rPr>
+          <w:rFonts w:ascii="Grandview" w:hAnsi="Grandview" w:cs="Arial"/>
+          <w:sz w:val="28"/>
+          <w:szCs w:val="28"/>
           <w:lang w:val="en-NZ"/>
         </w:rPr>
         <w:t>Find the category with the</w:t>
@@ -573,6 +994,8 @@
       <w:r>
         <w:rPr>
           <w:rFonts w:ascii="Grandview" w:hAnsi="Grandview" w:cs="Arial"/>
+          <w:sz w:val="28"/>
+          <w:szCs w:val="28"/>
           <w:lang w:val="en-NZ"/>
         </w:rPr>
         <w:t xml:space="preserve"> Views</w:t>
@@ -580,6 +1003,8 @@
       <w:r>
         <w:rPr>
           <w:rFonts w:ascii="Grandview" w:hAnsi="Grandview" w:cs="Arial"/>
+          <w:sz w:val="28"/>
+          <w:szCs w:val="28"/>
           <w:lang w:val="en-NZ"/>
         </w:rPr>
         <w:t xml:space="preserve"> by adding up all the </w:t>
@@ -587,6 +1012,8 @@
       <w:r>
         <w:rPr>
           <w:rFonts w:ascii="Grandview" w:hAnsi="Grandview" w:cs="Arial"/>
+          <w:sz w:val="28"/>
+          <w:szCs w:val="28"/>
           <w:lang w:val="en-NZ"/>
         </w:rPr>
         <w:t>Views</w:t>
@@ -594,6 +1021,8 @@
       <w:r>
         <w:rPr>
           <w:rFonts w:ascii="Grandview" w:hAnsi="Grandview" w:cs="Arial"/>
+          <w:sz w:val="28"/>
+          <w:szCs w:val="28"/>
           <w:lang w:val="en-NZ"/>
         </w:rPr>
         <w:t xml:space="preserve"> by each category.</w:t>
@@ -605,14 +1034,18 @@
           <w:rFonts w:ascii="Grandview" w:hAnsi="Grandview" w:cs="Arial"/>
           <w:b/>
           <w:bCs/>
-          <w:lang w:val="en-NZ"/>
-        </w:rPr>
-      </w:pPr>
-      <w:r>
-        <w:rPr>
-          <w:rFonts w:ascii="Grandview" w:hAnsi="Grandview" w:cs="Arial"/>
-          <w:b/>
-          <w:bCs/>
+          <w:sz w:val="28"/>
+          <w:szCs w:val="28"/>
+          <w:lang w:val="en-NZ"/>
+        </w:rPr>
+      </w:pPr>
+      <w:r>
+        <w:rPr>
+          <w:rFonts w:ascii="Grandview" w:hAnsi="Grandview" w:cs="Arial"/>
+          <w:b/>
+          <w:bCs/>
+          <w:sz w:val="28"/>
+          <w:szCs w:val="28"/>
           <w:lang w:val="en-NZ"/>
         </w:rPr>
         <w:t>- Chart8: The country that has the most youtubers in the top 100 list.</w:t>
@@ -621,17 +1054,19 @@
     <w:p>
       <w:pPr>
         <w:rPr>
-          <w:rFonts w:ascii="Grandview" w:hAnsi="Grandview" w:cs="Arial"/>
-          <w:b/>
-          <w:bCs/>
-          <w:lang w:val="en-NZ"/>
-        </w:rPr>
-      </w:pPr>
-      <w:r>
-        <w:rPr>
-          <w:rFonts w:ascii="Grandview" w:hAnsi="Grandview" w:cs="Arial"/>
-          <w:b/>
-          <w:bCs/>
+          <w:b/>
+          <w:bCs/>
+          <w:sz w:val="28"/>
+          <w:szCs w:val="28"/>
+        </w:rPr>
+      </w:pPr>
+      <w:r>
+        <w:rPr>
+          <w:rFonts w:ascii="Grandview" w:hAnsi="Grandview" w:cs="Arial"/>
+          <w:b/>
+          <w:bCs/>
+          <w:sz w:val="28"/>
+          <w:szCs w:val="28"/>
           <w:lang w:val="en-NZ"/>
         </w:rPr>
         <w:t xml:space="preserve">- Chart9: The name of the channel with the most </w:t>
@@ -641,6 +1076,8 @@
           <w:rFonts w:ascii="Grandview" w:hAnsi="Grandview" w:cs="Arial"/>
           <w:b/>
           <w:bCs/>
+          <w:sz w:val="28"/>
+          <w:szCs w:val="28"/>
           <w:lang w:val="en-NZ"/>
         </w:rPr>
         <w:t>likes</w:t>
@@ -650,6 +1087,8 @@
           <w:rFonts w:ascii="Grandview" w:hAnsi="Grandview" w:cs="Arial"/>
           <w:b/>
           <w:bCs/>
+          <w:sz w:val="28"/>
+          <w:szCs w:val="28"/>
           <w:lang w:val="en-NZ"/>
         </w:rPr>
         <w:t>.</w:t>
@@ -659,84 +1098,14 @@
           <w:rFonts w:ascii="Grandview" w:hAnsi="Grandview" w:cs="Arial"/>
           <w:b/>
           <w:bCs/>
+          <w:sz w:val="28"/>
+          <w:szCs w:val="28"/>
           <w:lang w:val="en-NZ"/>
         </w:rPr>
         <w:t> </w:t>
       </w:r>
     </w:p>
-    <w:p>
-      <w:pPr>
-        <w:rPr>
-          <w:rFonts w:ascii="Grandview" w:hAnsi="Grandview" w:cs="Arial"/>
-          <w:b/>
-          <w:bCs/>
-          <w:lang w:val="en-NZ"/>
-        </w:rPr>
-      </w:pPr>
-    </w:p>
-    <w:p>
-      <w:pPr>
-        <w:rPr>
-          <w:b/>
-          <w:bCs/>
-        </w:rPr>
-      </w:pPr>
-      <w:r>
-        <w:rPr>
-          <w:rFonts w:ascii="Grandview" w:hAnsi="Grandview" w:cs="Arial"/>
-          <w:b/>
-          <w:bCs/>
-          <w:lang w:val="en-NZ"/>
-        </w:rPr>
-        <w:t>2    2   2    3</w:t>
-      </w:r>
-    </w:p>
-    <w:p>
-      <w:r>
-        <w:t xml:space="preserve"> </w:t>
-      </w:r>
-    </w:p>
-    <w:p>
-      <w:r>
-        <w:t xml:space="preserve">Haocheng </w:t>
-      </w:r>
-      <w:r>
-        <w:t>(6 8 9)</w:t>
-      </w:r>
-    </w:p>
-    <w:p>
-      <w:r>
-        <w:t xml:space="preserve">Mary: </w:t>
-      </w:r>
-      <w:r>
-        <w:t xml:space="preserve">(1,2) </w:t>
-      </w:r>
-    </w:p>
-    <w:p>
-      <w:r>
-        <w:t>Tarun</w:t>
-      </w:r>
-      <w:r>
-        <w:t xml:space="preserve"> </w:t>
-      </w:r>
-      <w:r>
-        <w:t>(3,4)</w:t>
-      </w:r>
-      <w:r>
-        <w:t xml:space="preserve"> </w:t>
-      </w:r>
-    </w:p>
-    <w:p>
-      <w:r>
-        <w:t xml:space="preserve"> </w:t>
-      </w:r>
-      <w:r>
-        <w:t xml:space="preserve">Pedro </w:t>
-      </w:r>
-      <w:r>
-        <w:t>(5,7)</w:t>
-      </w:r>
-    </w:p>
+    <w:p/>
     <w:sectPr>
       <w:pgSz w:w="12240" w:h="15840"/>
       <w:pgMar w:top="1440" w:right="1440" w:bottom="1440" w:left="1440" w:header="708" w:footer="708" w:gutter="0"/>

</xml_diff>

<commit_message>
update the Typo, and add todo
</commit_message>
<xml_diff>
--- a/CustomerBChart/customerBchartRequirements.docx
+++ b/CustomerBChart/customerBchartRequirements.docx
@@ -101,20 +101,8 @@
           <w:sz w:val="28"/>
           <w:szCs w:val="28"/>
         </w:rPr>
-        <w:t xml:space="preserve"> </w:t>
-      </w:r>
-      <w:proofErr w:type="spellStart"/>
-      <w:r>
-        <w:rPr>
-          <w:rFonts w:ascii="Grandview" w:hAnsi="Grandview"/>
-          <w:b/>
-          <w:bCs/>
-          <w:sz w:val="28"/>
-          <w:szCs w:val="28"/>
-        </w:rPr>
-        <w:t>ui</w:t>
-      </w:r>
-      <w:proofErr w:type="spellEnd"/>
+        <w:t xml:space="preserve"> ui</w:t>
+      </w:r>
       <w:r>
         <w:rPr>
           <w:rFonts w:ascii="Grandview" w:hAnsi="Grandview"/>
@@ -347,31 +335,7 @@
           <w:szCs w:val="28"/>
           <w:lang w:val="en-NZ"/>
         </w:rPr>
-        <w:t xml:space="preserve">(switch </w:t>
-      </w:r>
-      <w:proofErr w:type="spellStart"/>
-      <w:r>
-        <w:rPr>
-          <w:rFonts w:ascii="Grandview" w:hAnsi="Grandview" w:cs="Arial"/>
-          <w:b/>
-          <w:bCs/>
-          <w:sz w:val="28"/>
-          <w:szCs w:val="28"/>
-          <w:lang w:val="en-NZ"/>
-        </w:rPr>
-        <w:t>btn</w:t>
-      </w:r>
-      <w:proofErr w:type="spellEnd"/>
-      <w:r>
-        <w:rPr>
-          <w:rFonts w:ascii="Grandview" w:hAnsi="Grandview" w:cs="Arial"/>
-          <w:b/>
-          <w:bCs/>
-          <w:sz w:val="28"/>
-          <w:szCs w:val="28"/>
-          <w:lang w:val="en-NZ"/>
-        </w:rPr>
-        <w:t>)</w:t>
+        <w:t>(switch btn)</w:t>
       </w:r>
     </w:p>
     <w:p>
@@ -505,7 +469,75 @@
           <w:szCs w:val="28"/>
           <w:lang w:val="en-NZ"/>
         </w:rPr>
-        <w:t xml:space="preserve"> (check box)</w:t>
+        <w:t xml:space="preserve"> (check box</w:t>
+      </w:r>
+      <w:r>
+        <w:rPr>
+          <w:rFonts w:ascii="Grandview" w:hAnsi="Grandview" w:cs="Arial"/>
+          <w:b/>
+          <w:bCs/>
+          <w:sz w:val="28"/>
+          <w:szCs w:val="28"/>
+          <w:lang w:val="en-NZ"/>
+        </w:rPr>
+        <w:t xml:space="preserve">, </w:t>
+      </w:r>
+      <w:r>
+        <w:rPr>
+          <w:rFonts w:ascii="Grandview" w:hAnsi="Grandview" w:cs="Arial"/>
+          <w:b/>
+          <w:bCs/>
+          <w:color w:val="EE0000"/>
+          <w:sz w:val="28"/>
+          <w:szCs w:val="28"/>
+          <w:lang w:val="en-NZ"/>
+        </w:rPr>
+        <w:t>optional</w:t>
+      </w:r>
+      <w:r>
+        <w:rPr>
+          <w:rFonts w:ascii="Grandview" w:hAnsi="Grandview" w:cs="Arial"/>
+          <w:b/>
+          <w:bCs/>
+          <w:sz w:val="28"/>
+          <w:szCs w:val="28"/>
+          <w:lang w:val="en-NZ"/>
+        </w:rPr>
+        <w:t>)</w:t>
+      </w:r>
+      <w:r>
+        <w:rPr>
+          <w:rFonts w:ascii="Grandview" w:hAnsi="Grandview" w:cs="Arial"/>
+          <w:b/>
+          <w:bCs/>
+          <w:sz w:val="28"/>
+          <w:szCs w:val="28"/>
+          <w:lang w:val="en-NZ"/>
+        </w:rPr>
+        <w:t xml:space="preserve"> </w:t>
+      </w:r>
+    </w:p>
+    <w:p>
+      <w:pPr>
+        <w:rPr>
+          <w:rFonts w:ascii="Grandview" w:hAnsi="Grandview" w:cs="Arial"/>
+          <w:b/>
+          <w:bCs/>
+          <w:sz w:val="28"/>
+          <w:szCs w:val="28"/>
+          <w:lang w:val="en-NZ"/>
+        </w:rPr>
+      </w:pPr>
+      <w:r>
+        <w:rPr>
+          <w:rFonts w:ascii="Grandview" w:hAnsi="Grandview" w:cs="Arial"/>
+          <w:b/>
+          <w:bCs/>
+          <w:sz w:val="28"/>
+          <w:szCs w:val="28"/>
+          <w:lang w:val="en-NZ"/>
+        </w:rPr>
+        <w:t>brush functionality: once user select any parts, it will shows a total income for the selected parts</w:t>
       </w:r>
     </w:p>
     <w:p>
@@ -586,31 +618,7 @@
           <w:szCs w:val="28"/>
           <w:lang w:val="en-NZ"/>
         </w:rPr>
-        <w:t>‘</w:t>
-      </w:r>
-      <w:proofErr w:type="spellStart"/>
-      <w:r>
-        <w:rPr>
-          <w:rFonts w:ascii="Grandview" w:hAnsi="Grandview" w:cs="Arial"/>
-          <w:b/>
-          <w:bCs/>
-          <w:sz w:val="28"/>
-          <w:szCs w:val="28"/>
-          <w:lang w:val="en-NZ"/>
-        </w:rPr>
-        <w:t>MainTopic</w:t>
-      </w:r>
-      <w:proofErr w:type="spellEnd"/>
-      <w:r>
-        <w:rPr>
-          <w:rFonts w:ascii="Grandview" w:hAnsi="Grandview" w:cs="Arial"/>
-          <w:b/>
-          <w:bCs/>
-          <w:sz w:val="28"/>
-          <w:szCs w:val="28"/>
-          <w:lang w:val="en-NZ"/>
-        </w:rPr>
-        <w:t>’</w:t>
+        <w:t>‘MainTopic’</w:t>
       </w:r>
       <w:r>
         <w:rPr>
@@ -646,55 +654,16 @@
           <w:lang w:val="en-NZ"/>
         </w:rPr>
       </w:pPr>
-      <w:proofErr w:type="gramStart"/>
-      <w:r>
-        <w:rPr>
-          <w:rFonts w:ascii="Grandview" w:hAnsi="Grandview" w:cs="Arial"/>
-          <w:b/>
-          <w:bCs/>
-          <w:sz w:val="28"/>
-          <w:szCs w:val="28"/>
-          <w:lang w:val="en-NZ"/>
-        </w:rPr>
-        <w:t>( input</w:t>
-      </w:r>
-      <w:proofErr w:type="gramEnd"/>
-      <w:r>
-        <w:rPr>
-          <w:rFonts w:ascii="Grandview" w:hAnsi="Grandview" w:cs="Arial"/>
-          <w:b/>
-          <w:bCs/>
-          <w:sz w:val="28"/>
-          <w:szCs w:val="28"/>
-          <w:lang w:val="en-NZ"/>
-        </w:rPr>
-        <w:t xml:space="preserve">, </w:t>
-      </w:r>
-      <w:proofErr w:type="spellStart"/>
-      <w:proofErr w:type="gramStart"/>
-      <w:r>
-        <w:rPr>
-          <w:rFonts w:ascii="Grandview" w:hAnsi="Grandview" w:cs="Arial"/>
-          <w:b/>
-          <w:bCs/>
-          <w:sz w:val="28"/>
-          <w:szCs w:val="28"/>
-          <w:lang w:val="en-NZ"/>
-        </w:rPr>
-        <w:t>button,form</w:t>
-      </w:r>
-      <w:proofErr w:type="spellEnd"/>
-      <w:proofErr w:type="gramEnd"/>
-      <w:r>
-        <w:rPr>
-          <w:rFonts w:ascii="Grandview" w:hAnsi="Grandview" w:cs="Arial"/>
-          <w:b/>
-          <w:bCs/>
-          <w:sz w:val="28"/>
-          <w:szCs w:val="28"/>
-          <w:lang w:val="en-NZ"/>
-        </w:rPr>
-        <w:t>,</w:t>
+      <w:r>
+        <w:rPr>
+          <w:rFonts w:ascii="Grandview" w:hAnsi="Grandview" w:cs="Arial"/>
+          <w:b/>
+          <w:bCs/>
+          <w:sz w:val="28"/>
+          <w:szCs w:val="28"/>
+          <w:lang w:val="en-NZ"/>
+        </w:rPr>
+        <w:t>( input, button,form,</w:t>
       </w:r>
       <w:r>
         <w:rPr>

</xml_diff>